<commit_message>
docs(guide): add browser dev-mode workflow (inspect + github.dev)
Co-Authored-By: Claude Opus 4.8 <noreply@anthropic.com>
</commit_message>
<xml_diff>
--- a/docs/redaktirovanie-sajta.docx
+++ b/docs/redaktirovanie-sajta.docx
@@ -459,6 +459,226 @@
       </w:pPr>
       <w:r>
         <w:t xml:space="preserve">Подожди 1–2 минуты → обнови сайт и проверь.</w:t>
+      </w:r>
+    </w:p>
+    <w:p>
+      <w:pPr>
+        <w:pStyle w:val="Heading2"/>
+      </w:pPr>
+      <w:r>
+        <w:t xml:space="preserve">Как точечно найти, где менять (через браузер, как «режим разработчика»)</w:t>
+      </w:r>
+    </w:p>
+    <w:p>
+      <w:pPr>
+        <w:spacing w:after="120"/>
+      </w:pPr>
+      <w:r>
+        <w:t xml:space="preserve">Два инструмента, оба в браузере, ничего ставить не надо.</w:t>
+      </w:r>
+    </w:p>
+    <w:p>
+      <w:pPr>
+        <w:spacing w:after="120"/>
+      </w:pPr>
+      <w:r>
+        <w:rPr>
+          <w:b/>
+          <w:bCs/>
+        </w:rPr>
+        <w:t xml:space="preserve">1. «Просмотреть код» (Inspect / F12) — взять точный текст с сайта.</w:t>
+      </w:r>
+    </w:p>
+    <w:p>
+      <w:pPr>
+        <w:pStyle w:val="ListParagraph"/>
+        <w:numPr>
+          <w:ilvl w:val="0"/>
+          <w:numId w:val="3"/>
+        </w:numPr>
+        <w:spacing w:after="40"/>
+      </w:pPr>
+      <w:r>
+        <w:t xml:space="preserve">Правый клик по элементу на сайте → «Просмотреть код» (или клавиша F12).</w:t>
+      </w:r>
+    </w:p>
+    <w:p>
+      <w:pPr>
+        <w:pStyle w:val="ListParagraph"/>
+        <w:numPr>
+          <w:ilvl w:val="0"/>
+          <w:numId w:val="3"/>
+        </w:numPr>
+        <w:spacing w:after="40"/>
+      </w:pPr>
+      <w:r>
+        <w:t xml:space="preserve">Скопируй точный кусок текста, который видишь (название «RCF EVOX 8», абзац статьи).</w:t>
+      </w:r>
+    </w:p>
+    <w:p>
+      <w:pPr>
+        <w:pStyle w:val="ListParagraph"/>
+        <w:numPr>
+          <w:ilvl w:val="0"/>
+          <w:numId w:val="3"/>
+        </w:numPr>
+        <w:spacing w:after="40"/>
+      </w:pPr>
+      <w:r>
+        <w:t xml:space="preserve">Цены ищи по названию товара, а не по числу: на сайте «1 500 000 ₸», а в файле это 1500000.</w:t>
+      </w:r>
+    </w:p>
+    <w:p>
+      <w:pPr>
+        <w:spacing w:after="120"/>
+      </w:pPr>
+      <w:r>
+        <w:rPr>
+          <w:b/>
+          <w:bCs/>
+        </w:rPr>
+        <w:t xml:space="preserve">2. github.dev — редактор как у разработчика, прямо в браузере.</w:t>
+      </w:r>
+    </w:p>
+    <w:p>
+      <w:pPr>
+        <w:pStyle w:val="ListParagraph"/>
+        <w:numPr>
+          <w:ilvl w:val="0"/>
+          <w:numId w:val="3"/>
+        </w:numPr>
+        <w:spacing w:after="40"/>
+      </w:pPr>
+      <w:r>
+        <w:t xml:space="preserve">Открой репозиторий на github.com и нажми клавишу «.» (точка) — откроется VS Code в браузере (github.dev).</w:t>
+      </w:r>
+    </w:p>
+    <w:p>
+      <w:pPr>
+        <w:pStyle w:val="ListParagraph"/>
+        <w:numPr>
+          <w:ilvl w:val="0"/>
+          <w:numId w:val="3"/>
+        </w:numPr>
+        <w:spacing w:after="40"/>
+      </w:pPr>
+      <w:r>
+        <w:t xml:space="preserve">Поиск по всему проекту: Ctrl+Shift+F (на Mac — Cmd+Shift+F).</w:t>
+      </w:r>
+    </w:p>
+    <w:p>
+      <w:pPr>
+        <w:pStyle w:val="ListParagraph"/>
+        <w:numPr>
+          <w:ilvl w:val="0"/>
+          <w:numId w:val="3"/>
+        </w:numPr>
+        <w:spacing w:after="40"/>
+      </w:pPr>
+      <w:r>
+        <w:t xml:space="preserve">Вставь скопированный текст → редактор покажет нужный файл и строку. Кликни — попадёшь точно в место.</w:t>
+      </w:r>
+    </w:p>
+    <w:p>
+      <w:pPr>
+        <w:pStyle w:val="ListParagraph"/>
+        <w:numPr>
+          <w:ilvl w:val="0"/>
+          <w:numId w:val="3"/>
+        </w:numPr>
+        <w:spacing w:after="40"/>
+      </w:pPr>
+      <w:r>
+        <w:t xml:space="preserve">Поменяй → слева значок «Source Control» → напиши, что менял → Commit &amp; Push.</w:t>
+      </w:r>
+    </w:p>
+    <w:p>
+      <w:pPr>
+        <w:spacing w:after="120"/>
+      </w:pPr>
+      <w:r>
+        <w:rPr>
+          <w:b/>
+          <w:bCs/>
+        </w:rPr>
+        <w:t xml:space="preserve">Связка целиком (точечно):</w:t>
+      </w:r>
+    </w:p>
+    <w:p>
+      <w:pPr>
+        <w:pStyle w:val="ListParagraph"/>
+        <w:numPr>
+          <w:ilvl w:val="0"/>
+          <w:numId w:val="2"/>
+        </w:numPr>
+        <w:spacing w:after="40"/>
+      </w:pPr>
+      <w:r>
+        <w:t xml:space="preserve">Видишь на сайте, что поменять.</w:t>
+      </w:r>
+    </w:p>
+    <w:p>
+      <w:pPr>
+        <w:pStyle w:val="ListParagraph"/>
+        <w:numPr>
+          <w:ilvl w:val="0"/>
+          <w:numId w:val="2"/>
+        </w:numPr>
+        <w:spacing w:after="40"/>
+      </w:pPr>
+      <w:r>
+        <w:t xml:space="preserve">Правый клик → «Просмотреть код» → скопируй точный текст.</w:t>
+      </w:r>
+    </w:p>
+    <w:p>
+      <w:pPr>
+        <w:pStyle w:val="ListParagraph"/>
+        <w:numPr>
+          <w:ilvl w:val="0"/>
+          <w:numId w:val="2"/>
+        </w:numPr>
+        <w:spacing w:after="40"/>
+      </w:pPr>
+      <w:r>
+        <w:t xml:space="preserve">В репозитории нажми «.» → откроется github.dev.</w:t>
+      </w:r>
+    </w:p>
+    <w:p>
+      <w:pPr>
+        <w:pStyle w:val="ListParagraph"/>
+        <w:numPr>
+          <w:ilvl w:val="0"/>
+          <w:numId w:val="2"/>
+        </w:numPr>
+        <w:spacing w:after="40"/>
+      </w:pPr>
+      <w:r>
+        <w:t xml:space="preserve">Ctrl/Cmd+Shift+F → вставь текст → перейди в найденную строку.</w:t>
+      </w:r>
+    </w:p>
+    <w:p>
+      <w:pPr>
+        <w:pStyle w:val="ListParagraph"/>
+        <w:numPr>
+          <w:ilvl w:val="0"/>
+          <w:numId w:val="2"/>
+        </w:numPr>
+        <w:spacing w:after="40"/>
+      </w:pPr>
+      <w:r>
+        <w:t xml:space="preserve">Исправь → Commit &amp; Push. Через 1–2 минуты сайт обновится.</w:t>
+      </w:r>
+    </w:p>
+    <w:p>
+      <w:pPr>
+        <w:spacing w:after="120"/>
+      </w:pPr>
+      <w:r>
+        <w:rPr>
+          <w:i/>
+          <w:iCs/>
+        </w:rPr>
+        <w:t xml:space="preserve">Без редактора тоже можно: ищи прямо на github.com — кнопка поиска вверху, вставляешь текст, «In this repository».</w:t>
       </w:r>
     </w:p>
     <w:p>

</xml_diff>